<commit_message>
Load Geist, retake screenshots, and qualify two figures in the docs
Co-Authored-By: Claude Opus 5.5 (1M context) <noreply@anthropic.com>
</commit_message>
<xml_diff>
--- a/docs/WHAT-I-BUILT.docx
+++ b/docs/WHAT-I-BUILT.docx
@@ -3301,7 +3301,19 @@
         <w:pStyle w:val="BodyText"/>
       </w:pPr>
       <w:r>
-        <w:t xml:space="preserve">Take the cheapest from anyone and it is ₹3.91 cr.</w:t>
+        <w:t xml:space="preserve">Take the cheapest from anyone and it is ₹3.91 cr. (These are the live site's</w:t>
+      </w:r>
+      <w:r>
+        <w:t xml:space="preserve"> </w:t>
+      </w:r>
+      <w:r>
+        <w:t xml:space="preserve">figures, from real reads with contested photo prices excluded. The offline</w:t>
+      </w:r>
+      <w:r>
+        <w:t xml:space="preserve"> </w:t>
+      </w:r>
+      <w:r>
+        <w:t xml:space="preserve">reference data, which has no contested readings, gives ₹3.88 cr.)</w:t>
       </w:r>
       <w:r>
         <w:t xml:space="preserve"> </w:t>
@@ -4587,7 +4599,13 @@
         <w:t xml:space="preserve"> </w:t>
       </w:r>
       <w:r>
-        <w:t xml:space="preserve">Then the same rate card as five photographs of falling</w:t>
+        <w:t xml:space="preserve">These figures are from a local run on Gemini 3.1 Pro, first</w:t>
+      </w:r>
+      <w:r>
+        <w:t xml:space="preserve"> </w:t>
+      </w:r>
+      <w:r>
+        <w:t xml:space="preserve">recorded on 2026-09-10; the results are not yet committed. See EVALS.md (planned). Then the same rate card as five photographs of falling</w:t>
       </w:r>
       <w:r>
         <w:t xml:space="preserve"> </w:t>

</xml_diff>